<commit_message>
Add Projects section (site + CV) showcasing GitHub data repos
</commit_message>
<xml_diff>
--- a/Achebe_Justice_Chinecherem_Data_Scientist_CV.docx
+++ b/Achebe_Justice_Chinecherem_Data_Scientist_CV.docx
@@ -679,6 +679,114 @@
           <w:color w:val="000000"/>
           <w:sz w:val="23"/>
         </w:rPr>
+        <w:t>PROJECTS</w:t>
+      </w:r>
+    </w:p>
+    <w:p>
+      <w:pPr>
+        <w:spacing w:before="120" w:after="0"/>
+      </w:pPr>
+      <w:r>
+        <w:rPr>
+          <w:b/>
+          <w:sz w:val="21"/>
+        </w:rPr>
+        <w:t>Machine and Deep Learning Models</w:t>
+      </w:r>
+    </w:p>
+    <w:p>
+      <w:pPr>
+        <w:spacing w:after="0"/>
+      </w:pPr>
+      <w:r>
+        <w:rPr>
+          <w:sz w:val="21"/>
+        </w:rPr>
+        <w:t>Jupyter notebooks implementing ML and DL models, including Apriori association-rule mining on retail transaction data and an LSTM network for sequence prediction.  github.com/eljustino2/ML-DL-MODELS</w:t>
+      </w:r>
+    </w:p>
+    <w:p>
+      <w:pPr>
+        <w:spacing w:before="120" w:after="0"/>
+      </w:pPr>
+      <w:r>
+        <w:rPr>
+          <w:b/>
+          <w:sz w:val="21"/>
+        </w:rPr>
+        <w:t>SQL Analysis: World Layoffs</w:t>
+      </w:r>
+    </w:p>
+    <w:p>
+      <w:pPr>
+        <w:spacing w:after="0"/>
+      </w:pPr>
+      <w:r>
+        <w:rPr>
+          <w:sz w:val="21"/>
+        </w:rPr>
+        <w:t>End-to-end SQL project on global layoffs data: database creation, data cleaning, and exploratory analysis queries.  github.com/eljustino2/MYSQL-TEST-PROJECTS</w:t>
+      </w:r>
+    </w:p>
+    <w:p>
+      <w:pPr>
+        <w:spacing w:before="120" w:after="0"/>
+      </w:pPr>
+      <w:r>
+        <w:rPr>
+          <w:b/>
+          <w:sz w:val="21"/>
+        </w:rPr>
+        <w:t>Classification and Regression Models</w:t>
+      </w:r>
+    </w:p>
+    <w:p>
+      <w:pPr>
+        <w:spacing w:after="0"/>
+      </w:pPr>
+      <w:r>
+        <w:rPr>
+          <w:sz w:val="21"/>
+        </w:rPr>
+        <w:t>Logistic regression and core machine-learning algorithms applied to the Titanic survival and SUV purchase datasets.  github.com/eljustino2/Regression</w:t>
+      </w:r>
+    </w:p>
+    <w:p>
+      <w:pPr>
+        <w:spacing w:before="120" w:after="0"/>
+      </w:pPr>
+      <w:r>
+        <w:rPr>
+          <w:b/>
+          <w:sz w:val="21"/>
+        </w:rPr>
+        <w:t>US Household Income Exploratory Analysis</w:t>
+      </w:r>
+    </w:p>
+    <w:p>
+      <w:pPr>
+        <w:spacing w:after="0"/>
+      </w:pPr>
+      <w:r>
+        <w:rPr>
+          <w:sz w:val="21"/>
+        </w:rPr>
+        <w:t>Exploratory data analysis of United States household income (2015), from data cleaning through visualization-driven insights.  github.com/eljustino2/HOUSEHOULD_INCOME_USA</w:t>
+      </w:r>
+    </w:p>
+    <w:p>
+      <w:pPr>
+        <w:spacing w:before="200" w:after="80"/>
+        <w:pBdr>
+          <w:bottom w:val="single" w:sz="6" w:space="1" w:color="000000"/>
+        </w:pBdr>
+      </w:pPr>
+      <w:r>
+        <w:rPr>
+          <w:b/>
+          <w:color w:val="000000"/>
+          <w:sz w:val="23"/>
+        </w:rPr>
         <w:t>AWARDS</w:t>
       </w:r>
     </w:p>

</xml_diff>